<commit_message>
Define MRP and RMSE at first use; cite Gelman and Little (1997)
Co-Authored-By: Claude Opus 5.5 <noreply@anthropic.com>
Claude-Session: https://claude.ai/code/session_01Prxgf8j9tuTLkeKytz9jrx
</commit_message>
<xml_diff>
--- a/mrp_raking_simulation/paper/MRP_vs_raking_working_paper.docx
+++ b/mrp_raking_simulation/paper/MRP_vs_raking_working_paper.docx
@@ -33,7 +33,7 @@
     <w:p>
       <w:pPr/>
       <w:r>
-        <w:t xml:space="preserve">Use MRP when you need estimates for small subgroups, above all subgroups the sample under-covers, and when the sample is small. In our simulation MRP cut the error for a small, undersampled region by more than half at n = 200 (RMSE 9.4 vs. 21.9 percentage points for the better raking estimator). For national estimates the two methods converge once n reaches about 500, and raking on the right margins is as accurate as MRP and simpler.</w:t>
+        <w:t xml:space="preserve">Use multilevel regression and poststratification (MRP, often called "Mister P"; Gelman and Little 1997) when you need estimates for small subgroups, above all subgroups the sample under-covers, and when the sample is small. In our simulation MRP cut the error for a small, undersampled region by more than half at n = 200 (root mean squared error, RMSE, 9.4 vs. 21.9 percentage points for the better raking estimator). For national estimates the two methods converge once n reaches about 500, and raking on the right margins is as accurate as MRP and simpler.</w:t>
       </w:r>
     </w:p>
     <w:p>
@@ -1435,6 +1435,21 @@
       </w:hyperlink>
       <w:r>
         <w:t xml:space="preserve">.</w:t>
+      </w:r>
+    </w:p>
+    <w:p>
+      <w:pPr/>
+      <w:r>
+        <w:t xml:space="preserve">Gelman, A. and Little, T. C. (1997). Poststratification into many categories using hierarchical logistic regression. </w:t>
+      </w:r>
+      <w:r>
+        <w:rPr>
+          <w:i/>
+        </w:rPr>
+        <w:t xml:space="preserve">Survey Methodology</w:t>
+      </w:r>
+      <w:r>
+        <w:t xml:space="preserve"> 23(2): 127–135.</w:t>
       </w:r>
     </w:p>
     <w:sectPr>

</xml_diff>